<commit_message>
returning after long pause - updated main mkdocs - write elephant in the room
</commit_message>
<xml_diff>
--- a/cudmore-narrative-cv/libreoffice/cudmore-cv-skeleton.docx
+++ b/cudmore-narrative-cv/libreoffice/cudmore-cv-skeleton.docx
@@ -20,7 +20,7 @@
           <w:sz w:val="22"/>
           <w:szCs w:val="22"/>
         </w:rPr>
-        <w:t>Robert H. Cudmore, Ph.D.</w:t>
+        <w:t>Robert H. Cudmore, PhD</w:t>
         <w:tab/>
       </w:r>
       <w:r>
@@ -160,7 +160,7 @@
       </w:pPr>
       <w:r>
         <w:rPr/>
-        <w:t>&lt;&lt;insert here&gt;&gt;</w:t>
+        <w:t>&lt;&lt;insert cv narative here&gt;&gt;</w:t>
       </w:r>
     </w:p>
     <w:p>
@@ -206,9 +206,10 @@
     </w:p>
     <w:p>
       <w:pPr>
-        <w:pStyle w:val="cvheader1"/>
-        <w:rPr/>
-      </w:pPr>
+        <w:pStyle w:val="Heading2"/>
+        <w:rPr/>
+      </w:pPr>
+      <w:bookmarkStart w:id="1" w:name="research-software-platforms_Copy_1"/>
       <w:r>
         <w:rPr/>
         <w:t>Research Software Platforms</w:t>
@@ -216,18 +217,24 @@
     </w:p>
     <w:p>
       <w:pPr>
-        <w:pStyle w:val="cvheader2"/>
-        <w:rPr/>
-      </w:pPr>
-      <w:bookmarkStart w:id="1" w:name="cloudscope-suite"/>
-      <w:r>
-        <w:rPr/>
+        <w:pStyle w:val="Heading3"/>
+        <w:rPr>
+          <w:i/>
+          <w:iCs/>
+        </w:rPr>
+      </w:pPr>
+      <w:bookmarkStart w:id="2" w:name="cloudscope-suite"/>
+      <w:r>
+        <w:rPr>
+          <w:i/>
+          <w:iCs/>
+        </w:rPr>
         <w:t>CloudScope Suite</w:t>
       </w:r>
     </w:p>
     <w:p>
       <w:pPr>
-        <w:pStyle w:val="cvbody"/>
+        <w:pStyle w:val="FirstParagraph"/>
         <w:rPr/>
       </w:pPr>
       <w:r>
@@ -237,7 +244,7 @@
     </w:p>
     <w:p>
       <w:pPr>
-        <w:pStyle w:val="cvbody"/>
+        <w:pStyle w:val="BodyText"/>
         <w:rPr/>
       </w:pPr>
       <w:hyperlink r:id="rId5">
@@ -250,12 +257,12 @@
       </w:hyperlink>
       <w:r>
         <w:rPr/>
-        <w:t xml:space="preserve"> is a desktop application for macOS and Windows. Researchers use its graphical interface to load and visualize images, run analyses, inspect results, and curate the resulting data. Its semi-automated workflows allow potentially hundreds of raw image files to be analyzed efficiently while retaining human scientific judgment. Current analysis domains focus on kymograph line-scan images and include capillary blood-flow velocity, heartbeat derived from velocity, diameter changes in cardiac myocytes and smooth muscle, and peak detection from fluorescent reporters such as GCaMP calcium and ATP reporters.</w:t>
-      </w:r>
-    </w:p>
-    <w:p>
-      <w:pPr>
-        <w:pStyle w:val="cvbody"/>
+        <w:t xml:space="preserve"> is a desktop application for macOS and Windows. Its graphical interface allows researchers to load and visualize images, perform analyses implemented in AcqStore, inspect and curate results, and save and reload completed work. Its semi-automated workflows allow hundreds of raw image files to be analyzed efficiently and provide graphical tools for human-in-the-loop curation of the results. CloudScope also supports blinded and randomized analysis and curation, allowing large datasets to be reviewed systematically while helping reduce experimenter bias.</w:t>
+      </w:r>
+    </w:p>
+    <w:p>
+      <w:pPr>
+        <w:pStyle w:val="BodyText"/>
         <w:rPr/>
       </w:pPr>
       <w:r>
@@ -272,12 +279,22 @@
       </w:hyperlink>
       <w:r>
         <w:rPr/>
-        <w:t xml:space="preserve"> as its Python analysis backend. Analysis algorithms are implemented in AcqStore and made accessible to researchers through CloudScope’s graphical interface. AcqStore also loads raw images, including proprietary microscope file formats. After analysis and curation, it saves the raw images, analysis methods, detection parameters, and results together in a self-contained dataset. This preserves the information needed to reconstruct how an analysis was performed even as analytical methods evolve. AcqStore can export Open Microscopy Environment Zarr (OME-Zarr) and Neurodata Without Borders (NWB) datasets for direct upload to public repositories such as the DANDI Archive and the Brain Image Library.</w:t>
-      </w:r>
-    </w:p>
-    <w:p>
-      <w:pPr>
-        <w:pStyle w:val="cvbody"/>
+        <w:t xml:space="preserve"> as its Python analysis backend. AcqStore loads raw images, including proprietary microscope file formats, implements quantitative analysis algorithms, manages results, and saves completed work. Its documented Python API allows the same algorithms available through the CloudScope desktop application to be used directly in scripts and computational notebooks. After analysis and curation, AcqStore saves the raw images, analysis methods, detection parameters, and results together in a self-contained dataset. This preserves the information needed to reconstruct how an analysis was performed even as analytical methods evolve. AcqStore exports Open Microscopy Environment Zarr (OME-Zarr) and Neurodata Without Borders (NWB) datasets for direct upload to public repositories such as the DANDI Archive and the Brain Image Library.</w:t>
+      </w:r>
+    </w:p>
+    <w:p>
+      <w:pPr>
+        <w:pStyle w:val="BodyText"/>
+        <w:rPr/>
+      </w:pPr>
+      <w:r>
+        <w:rPr/>
+        <w:t>AcqStore currently implements analyses for kymograph line-scan images, including capillary blood-flow velocity, heartbeat derived from velocity, diameter changes in cardiac myocytes and smooth muscle, and peak detection from fluorescent reporters such as GCaMP and ATP reporters. Its extensible architecture allows new file loaders and analysis algorithms to be added and made available through the CloudScope desktop application, scripts, and computational notebooks without duplicating their implementation.</w:t>
+      </w:r>
+    </w:p>
+    <w:p>
+      <w:pPr>
+        <w:pStyle w:val="BodyText"/>
         <w:rPr/>
       </w:pPr>
       <w:r>
@@ -294,97 +311,250 @@
       </w:hyperlink>
       <w:r>
         <w:rPr/>
-        <w:t xml:space="preserve"> opens the same self-contained OME-Zarr datasets as interactive figures. It allows the raw data and analysis performed and curated in CloudScope to be presented with an interactive graphical interface on the web. A manuscript figure can therefore become a live, publicly accessible figure that remains connected to its analysis and underlying raw data. Readers can inspect reported results and use the accessible data for new analyses, hypotheses, model-building, and collaborations. CloudScope-Web does not require dedicated or complex server infrastructure, making these interactive figures easier to distribute with publications.</w:t>
+        <w:t xml:space="preserve"> opens the same self-contained OME-Zarr datasets saved by AcqStore as dynamic, interactive figures on publicly accessible web pages. Each web page presents the raw data and analysis performed with AcqStore and curated through CloudScope, allowing reported results to be examined alongside the raw data that produced them. The shared datasets remain available for new analyses, hypotheses, model-building, and collaborations. CloudScope-Web does not require dedicated or complex server infrastructure, making these interactive figures easier to distribute with publications.</w:t>
+      </w:r>
+      <w:bookmarkEnd w:id="2"/>
+    </w:p>
+    <w:p>
+      <w:pPr>
+        <w:pStyle w:val="Heading3"/>
+        <w:rPr>
+          <w:i/>
+          <w:iCs/>
+        </w:rPr>
+      </w:pPr>
+      <w:bookmarkStart w:id="3" w:name="sanpy"/>
+      <w:r>
+        <w:rPr>
+          <w:i/>
+          <w:iCs/>
+        </w:rPr>
+        <w:t>SanPy</w:t>
+      </w:r>
+    </w:p>
+    <w:p>
+      <w:pPr>
+        <w:pStyle w:val="FirstParagraph"/>
+        <w:rPr/>
+      </w:pPr>
+      <w:r>
+        <w:rPr/>
+        <w:t xml:space="preserve">Electrophysiology analysis frequently depends on manual measurements or laboratory-specific scripts. </w:t>
+      </w:r>
+      <w:hyperlink r:id="rId8">
+        <w:r>
+          <w:rPr>
+            <w:rStyle w:val="Hyperlink"/>
+          </w:rPr>
+          <w:t>SanPy</w:t>
+        </w:r>
+      </w:hyperlink>
+      <w:r>
+        <w:rPr/>
+        <w:t xml:space="preserve"> is a general-purpose event-detection and analysis platform for whole-cell current-clamp recordings from neurons and cardiac myocytes. Its primary use is action-potential analysis, but it can also detect and analyze subthreshold events. Once a peak is detected, SanPy applies the same downstream analysis and extracts more than 20 quantitative features from each event.</w:t>
+      </w:r>
+    </w:p>
+    <w:p>
+      <w:pPr>
+        <w:pStyle w:val="BodyText"/>
+        <w:rPr/>
+      </w:pPr>
+      <w:r>
+        <w:rPr/>
+        <w:t>The SanPy desktop application allows researchers to open individual recordings or folders and apply detection presets for fast neurons, slow neurons, cardiac myocytes, or subthreshold events. Detected events and their measurements are overlaid on the raw recording, allowing researchers to evaluate the analysis in the context of the original signal and identify results that require curation. Linked graphical views and detection-error summaries support review and curation of individual events. Researchers can save completed analyses, export tabular results, and generate figures from the same workflow.</w:t>
+      </w:r>
+    </w:p>
+    <w:p>
+      <w:pPr>
+        <w:pStyle w:val="BodyText"/>
+        <w:rPr/>
+      </w:pPr>
+      <w:r>
+        <w:rPr/>
+        <w:t>SanPy’s documented Python API gives scripts and computational notebooks access to the same detection and analysis methods used by the desktop application. Extensible file loaders, measurements, and graphical plugins allow new research needs to be incorporated without creating a separate analysis system. SanPy supports analysis during electrophysiology experiments, offline analysis, and inspection of published analyzed datasets.</w:t>
+      </w:r>
+      <w:bookmarkEnd w:id="3"/>
+    </w:p>
+    <w:p>
+      <w:pPr>
+        <w:pStyle w:val="Heading3"/>
+        <w:rPr>
+          <w:i/>
+          <w:iCs/>
+        </w:rPr>
+      </w:pPr>
+      <w:bookmarkStart w:id="4" w:name="mapmanager"/>
+      <w:r>
+        <w:rPr>
+          <w:i/>
+          <w:iCs/>
+        </w:rPr>
+        <w:t>MapManager</w:t>
+      </w:r>
+    </w:p>
+    <w:p>
+      <w:pPr>
+        <w:pStyle w:val="FirstParagraph"/>
+        <w:rPr/>
+      </w:pPr>
+      <w:r>
+        <w:rPr/>
+        <w:t>Longitudinal three-dimensional microscopy studies require researchers to align images and identify the same biological structures across imaging sessions that may span weeks or months. MapManager is routinely used with longitudinal datasets acquired from awake, behaving mice. It allows researchers to examine the persistence, addition, elimination, movement, and fluorescence intensity of structures such as dendritic spines and cell bodies.</w:t>
+      </w:r>
+    </w:p>
+    <w:p>
+      <w:pPr>
+        <w:pStyle w:val="BodyText"/>
+        <w:rPr/>
+      </w:pPr>
+      <w:r>
+        <w:rPr/>
+        <w:t>The established Igor Pro version of MapManager automatically aligns images between time points and semi-automatically identifies corresponding annotations across sessions. Researchers can trace neuronal dendritic segments, and MapManager automatically connects each annotated spine to its parent segment. It creates regions of interest for each spine that include the spine, its dendritic segment, and associated ground-truth background measurements. These intensity measurements support longitudinal analysis of submicron, diffraction-limited dendritic spines. Researchers can visualize, annotate, measure, and curate collections containing tens of thousands of annotations. This workflow has supported at least five peer-reviewed publications.</w:t>
+      </w:r>
+    </w:p>
+    <w:p>
+      <w:pPr>
+        <w:pStyle w:val="BodyText"/>
+        <w:rPr/>
+      </w:pPr>
+      <w:r>
+        <w:rPr/>
+        <w:t>I am rebuilding this proven workflow as an open-source, extensible, and reproducible software ecosystem. The modern MapManager is under active development and reduces dependence on proprietary software while making its longitudinal-analysis methods easier to reuse, extend, and share.</w:t>
+      </w:r>
+    </w:p>
+    <w:p>
+      <w:pPr>
+        <w:pStyle w:val="BodyText"/>
+        <w:rPr/>
+      </w:pPr>
+      <w:r>
+        <w:rPr/>
+        <w:t>MapManagerCore provides the shared Python API for the modern ecosystem. PyMapManager is the desktop application and also makes the analysis available through Python scripts and computational notebooks. WebMapManager is the browser application for visualizing, annotating, and analyzing time-series annotations and three-dimensional image volumes. A working WebMapManager application is publicly available. Together, these components are designed to provide consistent scientific methods through desktop, browser, scripting, and notebook workflows.</w:t>
+      </w:r>
+      <w:bookmarkEnd w:id="4"/>
+    </w:p>
+    <w:p>
+      <w:pPr>
+        <w:pStyle w:val="Heading3"/>
+        <w:rPr>
+          <w:i/>
+          <w:iCs/>
+        </w:rPr>
+      </w:pPr>
+      <w:bookmarkStart w:id="5" w:name="pie"/>
+      <w:r>
+        <w:rPr>
+          <w:i/>
+          <w:iCs/>
+        </w:rPr>
+        <w:t>PiE</w:t>
+      </w:r>
+    </w:p>
+    <w:p>
+      <w:pPr>
+        <w:pStyle w:val="FirstParagraph"/>
+        <w:rPr/>
+      </w:pPr>
+      <w:r>
+        <w:rPr/>
+        <w:t xml:space="preserve">Behavioral experiments often require custom hardware control, video acquisition, environmental monitoring, and behavioral scoring. </w:t>
+      </w:r>
+      <w:hyperlink r:id="rId9">
+        <w:r>
+          <w:rPr>
+            <w:rStyle w:val="Hyperlink"/>
+          </w:rPr>
+          <w:t>PiE</w:t>
+        </w:r>
+      </w:hyperlink>
+      <w:r>
+        <w:rPr/>
+        <w:t xml:space="preserve"> is an open-source system for building reproducible home-cage behavioral experiments. Detailed construction instructions and modular, commercially available components allow an individual behavior-box design to be replicated across an array of boxes.</w:t>
+      </w:r>
+    </w:p>
+    <w:p>
+      <w:pPr>
+        <w:pStyle w:val="BodyText"/>
+        <w:rPr/>
+      </w:pPr>
+      <w:r>
+        <w:rPr/>
+        <w:t>Each behavior box can record and stream video, control white and infrared lighting and ventilation, monitor temperature and humidity, and log experimental events alongside the video. A web interface allows experiments to be configured, controlled, and monitored remotely, reducing the need for experimenters to remain beside the apparatus and potentially influence behavior.</w:t>
+      </w:r>
+    </w:p>
+    <w:p>
+      <w:pPr>
+        <w:pStyle w:val="BodyText"/>
+        <w:rPr/>
+      </w:pPr>
+      <w:r>
+        <w:rPr/>
+        <w:t>PiE can control and monitor any number of behavior boxes through a centralized web interface. System status, live video monitoring, remote controls, and file synchronization allow experiments to run in parallel and scale from one box to an array. PiE also provides an intuitive, general-purpose desktop application for behavioral scoring that allows researchers to annotate events and perform blinded scoring of randomized video segments. Together, these capabilities allow PiE to acquire around-the-clock video from multiple behavior boxes in parallel, control and monitor experiments remotely to reduce experimenter-induced changes in behavior, and support blinded and randomized behavioral scoring for more reproducible analysis of variable animal behavior.</w:t>
+      </w:r>
+      <w:bookmarkEnd w:id="5"/>
+    </w:p>
+    <w:p>
+      <w:pPr>
+        <w:pStyle w:val="Heading3"/>
+        <w:rPr>
+          <w:i/>
+          <w:iCs/>
+        </w:rPr>
+      </w:pPr>
+      <w:bookmarkStart w:id="6" w:name="brightest-path"/>
+      <w:r>
+        <w:rPr>
+          <w:i/>
+          <w:iCs/>
+        </w:rPr>
+        <w:t>Brightest Path</w:t>
+      </w:r>
+    </w:p>
+    <w:p>
+      <w:pPr>
+        <w:pStyle w:val="FirstParagraph"/>
+        <w:rPr/>
+      </w:pPr>
+      <w:r>
+        <w:rPr/>
+        <w:t xml:space="preserve">Tracing filament-like structures is a common problem in scientific image analysis. Axons and dendritic segments are important examples because their paths must be followed through microscopy images before their morphology can be visualized and measured. </w:t>
+      </w:r>
+      <w:hyperlink r:id="rId10">
+        <w:r>
+          <w:rPr>
+            <w:rStyle w:val="Hyperlink"/>
+          </w:rPr>
+          <w:t>Brightest Path</w:t>
+        </w:r>
+      </w:hyperlink>
+      <w:r>
+        <w:rPr/>
+        <w:t xml:space="preserve"> allows a researcher to select start and end points in an n-dimensional image and calculates the brightest path between them. The resulting image coordinates provide a quantitative representation of the traced structure for subsequent visualization and analysis.</w:t>
+      </w:r>
+    </w:p>
+    <w:p>
+      <w:pPr>
+        <w:pStyle w:val="BodyText"/>
+        <w:rPr/>
+      </w:pPr>
+      <w:r>
+        <w:rPr/>
+        <w:t xml:space="preserve">The tested and documented Python library can be used in scientific applications, scripts, and computational notebooks. A separate </w:t>
+      </w:r>
+      <w:hyperlink r:id="rId11">
+        <w:r>
+          <w:rPr>
+            <w:rStyle w:val="Hyperlink"/>
+          </w:rPr>
+          <w:t>napari tracing plugin</w:t>
+        </w:r>
+      </w:hyperlink>
+      <w:r>
+        <w:rPr/>
+        <w:t xml:space="preserve"> provides an interactive graphical interface for tracing neuronal dendrites and axons with the same underlying implementation. This makes a common image-analysis method reusable without requiring each laboratory or software project to recreate the algorithm.</w:t>
       </w:r>
       <w:bookmarkEnd w:id="1"/>
-    </w:p>
-    <w:p>
-      <w:pPr>
-        <w:pStyle w:val="cvheader2"/>
-        <w:rPr/>
-      </w:pPr>
-      <w:bookmarkStart w:id="2" w:name="sanpy"/>
-      <w:r>
-        <w:rPr/>
-        <w:t>SanPy</w:t>
-      </w:r>
-    </w:p>
-    <w:p>
-      <w:pPr>
-        <w:pStyle w:val="cvbody"/>
-        <w:rPr/>
-      </w:pPr>
-      <w:r>
-        <w:rPr/>
-        <w:t>Electrophysiology analysis frequently depends on manual measurements or laboratory-specific scripts. SanPy provides automated action-potential detection, quantitative measurements, interactive visualization, plugins, and a documented Python API. Its graphical and scripting workflows use the same computational implementation for real-time experiments, offline analysis, and inspection of published analyzed datasets.</w:t>
-      </w:r>
-      <w:bookmarkEnd w:id="2"/>
-    </w:p>
-    <w:p>
-      <w:pPr>
-        <w:pStyle w:val="cvheader2"/>
-        <w:rPr/>
-      </w:pPr>
-      <w:bookmarkStart w:id="3" w:name="mapmanager"/>
-      <w:r>
-        <w:rPr/>
-        <w:t>MapManager</w:t>
-      </w:r>
-    </w:p>
-    <w:p>
-      <w:pPr>
-        <w:pStyle w:val="cvbody"/>
-        <w:rPr/>
-      </w:pPr>
-      <w:r>
-        <w:rPr/>
-        <w:t>Longitudinal microscopy studies require researchers to connect measurements across imaging sessions that may span weeks or months. MapManager provides an open-source platform for annotation, visualization, and quantitative analysis of neuronal structure over time. It supports interactive review and curation of collections containing tens of thousands of annotations.</w:t>
-      </w:r>
-      <w:bookmarkEnd w:id="3"/>
-    </w:p>
-    <w:p>
-      <w:pPr>
-        <w:pStyle w:val="cvheader2"/>
-        <w:rPr/>
-      </w:pPr>
-      <w:bookmarkStart w:id="4" w:name="pie"/>
-      <w:r>
-        <w:rPr/>
-        <w:t>PiE</w:t>
-      </w:r>
-    </w:p>
-    <w:p>
-      <w:pPr>
-        <w:pStyle w:val="cvbody"/>
-        <w:rPr/>
-      </w:pPr>
-      <w:r>
-        <w:rPr/>
-        <w:t>Behavioral experiments often require custom hardware control, data acquisition, monitoring, and analysis. PiE integrates these functions through a web interface that supports remote experiment control and video monitoring. It reduces experimenter interference while providing a reusable framework for behavioral research.</w:t>
-      </w:r>
-      <w:bookmarkEnd w:id="4"/>
-    </w:p>
-    <w:p>
-      <w:pPr>
-        <w:pStyle w:val="cvheader2"/>
-        <w:rPr/>
-      </w:pPr>
-      <w:bookmarkStart w:id="5" w:name="brightest-path"/>
-      <w:r>
-        <w:rPr/>
-        <w:t>Brightest Path</w:t>
-      </w:r>
-    </w:p>
-    <w:p>
-      <w:pPr>
-        <w:pStyle w:val="cvbody"/>
-        <w:rPr/>
-      </w:pPr>
-      <w:r>
-        <w:rPr/>
-        <w:t>Brightest Path provides a tested, documented Python package for tracing brightest paths through n-dimensional scientific images. It makes a reusable image-analysis method available to other scientific projects without requiring each project to reimplement the algorithm.</w:t>
-      </w:r>
-      <w:bookmarkEnd w:id="5"/>
+      <w:bookmarkEnd w:id="6"/>
     </w:p>
     <w:p>
       <w:pPr>
@@ -412,11 +582,11 @@
         <w:tblLook w:noHBand="0" w:lastColumn="0" w:firstColumn="0" w:lastRow="0" w:firstRow="1" w:noVBand="0" w:val="0020"/>
       </w:tblPr>
       <w:tblGrid>
-        <w:gridCol w:w="2041"/>
+        <w:gridCol w:w="2038"/>
         <w:gridCol w:w="3829"/>
-        <w:gridCol w:w="1171"/>
-        <w:gridCol w:w="1800"/>
-        <w:gridCol w:w="1383"/>
+        <w:gridCol w:w="1174"/>
+        <w:gridCol w:w="1797"/>
+        <w:gridCol w:w="1386"/>
       </w:tblGrid>
       <w:tr>
         <w:trPr>
@@ -424,7 +594,7 @@
         </w:trPr>
         <w:tc>
           <w:tcPr>
-            <w:tcW w:w="2041" w:type="dxa"/>
+            <w:tcW w:w="2038" w:type="dxa"/>
             <w:tcBorders>
               <w:top w:val="single" w:sz="4" w:space="0" w:color="000000"/>
               <w:start w:val="single" w:sz="4" w:space="0" w:color="000000"/>
@@ -437,19 +607,16 @@
               <w:widowControl/>
               <w:spacing w:before="36" w:after="36"/>
               <w:rPr>
-                <w:rFonts w:ascii="Arial" w:hAnsi="Arial" w:eastAsia="" w:cs=""/>
-                <w:kern w:val="0"/>
-                <w:sz w:val="22"/>
-                <w:szCs w:val="22"/>
-                <w:lang w:val="en-US" w:eastAsia="zh-CN" w:bidi="ar-SA"/>
+                <w:sz w:val="20"/>
+                <w:szCs w:val="20"/>
               </w:rPr>
             </w:pPr>
             <w:r>
               <w:rPr>
                 <w:rFonts w:eastAsia="" w:cs=""/>
                 <w:kern w:val="0"/>
-                <w:sz w:val="22"/>
-                <w:szCs w:val="22"/>
+                <w:sz w:val="20"/>
+                <w:szCs w:val="20"/>
                 <w:lang w:val="en-US" w:eastAsia="zh-CN" w:bidi="ar-SA"/>
               </w:rPr>
               <w:t>CloudScope</w:t>
@@ -471,19 +638,16 @@
               <w:widowControl/>
               <w:spacing w:before="36" w:after="36"/>
               <w:rPr>
-                <w:rFonts w:ascii="Arial" w:hAnsi="Arial" w:eastAsia="" w:cs=""/>
-                <w:kern w:val="0"/>
-                <w:sz w:val="22"/>
-                <w:szCs w:val="22"/>
-                <w:lang w:val="en-US" w:eastAsia="zh-CN" w:bidi="ar-SA"/>
+                <w:sz w:val="20"/>
+                <w:szCs w:val="20"/>
               </w:rPr>
             </w:pPr>
             <w:r>
               <w:rPr>
                 <w:rFonts w:eastAsia="" w:cs=""/>
                 <w:kern w:val="0"/>
-                <w:sz w:val="22"/>
-                <w:szCs w:val="22"/>
+                <w:sz w:val="20"/>
+                <w:szCs w:val="20"/>
                 <w:lang w:val="en-US" w:eastAsia="zh-CN" w:bidi="ar-SA"/>
               </w:rPr>
               <w:t>Graphical analysis and curation of microscopy data</w:t>
@@ -492,7 +656,7 @@
         </w:tc>
         <w:tc>
           <w:tcPr>
-            <w:tcW w:w="1171" w:type="dxa"/>
+            <w:tcW w:w="1174" w:type="dxa"/>
             <w:tcBorders>
               <w:top w:val="single" w:sz="4" w:space="0" w:color="000000"/>
               <w:start w:val="single" w:sz="4" w:space="0" w:color="000000"/>
@@ -504,21 +668,16 @@
               <w:pStyle w:val="Compact"/>
               <w:widowControl/>
               <w:spacing w:before="36" w:after="36"/>
-              <w:rPr>
-                <w:rFonts w:eastAsia="" w:cs=""/>
-                <w:kern w:val="0"/>
-                <w:szCs w:val="24"/>
-                <w:lang w:val="en-US" w:eastAsia="zh-CN" w:bidi="ar-SA"/>
-              </w:rPr>
+              <w:rPr/>
             </w:pPr>
-            <w:hyperlink r:id="rId8">
+            <w:hyperlink r:id="rId12">
               <w:r>
                 <w:rPr>
                   <w:rStyle w:val="Hyperlink"/>
                   <w:rFonts w:eastAsia="" w:cs=""/>
                   <w:kern w:val="0"/>
-                  <w:sz w:val="22"/>
-                  <w:szCs w:val="22"/>
+                  <w:sz w:val="20"/>
+                  <w:szCs w:val="20"/>
                   <w:lang w:val="en-US" w:eastAsia="zh-CN" w:bidi="ar-SA"/>
                 </w:rPr>
                 <w:t>GitHub</w:t>
@@ -528,7 +687,7 @@
         </w:tc>
         <w:tc>
           <w:tcPr>
-            <w:tcW w:w="1800" w:type="dxa"/>
+            <w:tcW w:w="1797" w:type="dxa"/>
             <w:tcBorders>
               <w:top w:val="single" w:sz="4" w:space="0" w:color="000000"/>
               <w:start w:val="single" w:sz="4" w:space="0" w:color="000000"/>
@@ -540,21 +699,16 @@
               <w:pStyle w:val="Compact"/>
               <w:widowControl/>
               <w:spacing w:before="36" w:after="36"/>
-              <w:rPr>
-                <w:rFonts w:eastAsia="" w:cs=""/>
-                <w:kern w:val="0"/>
-                <w:szCs w:val="24"/>
-                <w:lang w:val="en-US" w:eastAsia="zh-CN" w:bidi="ar-SA"/>
-              </w:rPr>
+              <w:rPr/>
             </w:pPr>
-            <w:hyperlink r:id="rId9">
+            <w:hyperlink r:id="rId13">
               <w:r>
                 <w:rPr>
                   <w:rStyle w:val="Hyperlink"/>
                   <w:rFonts w:eastAsia="" w:cs=""/>
                   <w:kern w:val="0"/>
-                  <w:sz w:val="22"/>
-                  <w:szCs w:val="22"/>
+                  <w:sz w:val="20"/>
+                  <w:szCs w:val="20"/>
                   <w:lang w:val="en-US" w:eastAsia="zh-CN" w:bidi="ar-SA"/>
                 </w:rPr>
                 <w:t>Documentation</w:t>
@@ -564,7 +718,7 @@
         </w:tc>
         <w:tc>
           <w:tcPr>
-            <w:tcW w:w="1383" w:type="dxa"/>
+            <w:tcW w:w="1386" w:type="dxa"/>
             <w:tcBorders>
               <w:top w:val="single" w:sz="4" w:space="0" w:color="000000"/>
               <w:start w:val="single" w:sz="4" w:space="0" w:color="000000"/>
@@ -577,20 +731,15 @@
               <w:pStyle w:val="Compact"/>
               <w:widowControl/>
               <w:spacing w:before="36" w:after="36"/>
-              <w:rPr>
-                <w:rFonts w:eastAsia="" w:cs=""/>
-                <w:kern w:val="0"/>
-                <w:szCs w:val="24"/>
-                <w:lang w:val="en-US" w:eastAsia="zh-CN" w:bidi="ar-SA"/>
-              </w:rPr>
+              <w:rPr/>
             </w:pPr>
             <w:r>
               <w:rPr>
                 <w:rStyle w:val="Hyperlink"/>
                 <w:rFonts w:eastAsia="" w:cs=""/>
                 <w:kern w:val="0"/>
-                <w:sz w:val="22"/>
-                <w:szCs w:val="22"/>
+                <w:sz w:val="20"/>
+                <w:szCs w:val="20"/>
                 <w:lang w:val="en-US" w:eastAsia="zh-CN" w:bidi="ar-SA"/>
               </w:rPr>
               <w:t>Web App</w:t>
@@ -602,7 +751,7 @@
         <w:trPr/>
         <w:tc>
           <w:tcPr>
-            <w:tcW w:w="2041" w:type="dxa"/>
+            <w:tcW w:w="2038" w:type="dxa"/>
             <w:tcBorders>
               <w:start w:val="single" w:sz="4" w:space="0" w:color="000000"/>
               <w:bottom w:val="single" w:sz="4" w:space="0" w:color="000000"/>
@@ -614,19 +763,16 @@
               <w:widowControl/>
               <w:spacing w:before="36" w:after="36"/>
               <w:rPr>
-                <w:rFonts w:ascii="Arial" w:hAnsi="Arial" w:eastAsia="" w:cs=""/>
-                <w:kern w:val="0"/>
-                <w:sz w:val="22"/>
-                <w:szCs w:val="22"/>
-                <w:lang w:val="en-US" w:eastAsia="zh-CN" w:bidi="ar-SA"/>
+                <w:sz w:val="20"/>
+                <w:szCs w:val="20"/>
               </w:rPr>
             </w:pPr>
             <w:r>
               <w:rPr>
                 <w:rFonts w:eastAsia="" w:cs=""/>
                 <w:kern w:val="0"/>
-                <w:sz w:val="22"/>
-                <w:szCs w:val="22"/>
+                <w:sz w:val="20"/>
+                <w:szCs w:val="20"/>
                 <w:lang w:val="en-US" w:eastAsia="zh-CN" w:bidi="ar-SA"/>
               </w:rPr>
               <w:t>AcqStore</w:t>
@@ -647,19 +793,16 @@
               <w:widowControl/>
               <w:spacing w:before="36" w:after="36"/>
               <w:rPr>
-                <w:rFonts w:ascii="Arial" w:hAnsi="Arial" w:eastAsia="" w:cs=""/>
-                <w:kern w:val="0"/>
-                <w:sz w:val="22"/>
-                <w:szCs w:val="22"/>
-                <w:lang w:val="en-US" w:eastAsia="zh-CN" w:bidi="ar-SA"/>
+                <w:sz w:val="20"/>
+                <w:szCs w:val="20"/>
               </w:rPr>
             </w:pPr>
             <w:r>
               <w:rPr>
                 <w:rFonts w:eastAsia="" w:cs=""/>
                 <w:kern w:val="0"/>
-                <w:sz w:val="22"/>
-                <w:szCs w:val="22"/>
+                <w:sz w:val="20"/>
+                <w:szCs w:val="20"/>
                 <w:lang w:val="en-US" w:eastAsia="zh-CN" w:bidi="ar-SA"/>
               </w:rPr>
               <w:t>Reproducible image loading, analysis, and data export</w:t>
@@ -668,7 +811,7 @@
         </w:tc>
         <w:tc>
           <w:tcPr>
-            <w:tcW w:w="1171" w:type="dxa"/>
+            <w:tcW w:w="1174" w:type="dxa"/>
             <w:tcBorders>
               <w:start w:val="single" w:sz="4" w:space="0" w:color="000000"/>
               <w:bottom w:val="single" w:sz="4" w:space="0" w:color="000000"/>
@@ -679,21 +822,16 @@
               <w:pStyle w:val="Compact"/>
               <w:widowControl/>
               <w:spacing w:before="36" w:after="36"/>
-              <w:rPr>
-                <w:rFonts w:eastAsia="" w:cs=""/>
-                <w:kern w:val="0"/>
-                <w:szCs w:val="24"/>
-                <w:lang w:val="en-US" w:eastAsia="zh-CN" w:bidi="ar-SA"/>
-              </w:rPr>
+              <w:rPr/>
             </w:pPr>
-            <w:hyperlink r:id="rId10">
+            <w:hyperlink r:id="rId14">
               <w:r>
                 <w:rPr>
                   <w:rStyle w:val="Hyperlink"/>
                   <w:rFonts w:eastAsia="" w:cs=""/>
                   <w:kern w:val="0"/>
-                  <w:sz w:val="22"/>
-                  <w:szCs w:val="22"/>
+                  <w:sz w:val="20"/>
+                  <w:szCs w:val="20"/>
                   <w:lang w:val="en-US" w:eastAsia="zh-CN" w:bidi="ar-SA"/>
                 </w:rPr>
                 <w:t>GitHub</w:t>
@@ -703,7 +841,7 @@
         </w:tc>
         <w:tc>
           <w:tcPr>
-            <w:tcW w:w="1800" w:type="dxa"/>
+            <w:tcW w:w="1797" w:type="dxa"/>
             <w:tcBorders>
               <w:start w:val="single" w:sz="4" w:space="0" w:color="000000"/>
               <w:bottom w:val="single" w:sz="4" w:space="0" w:color="000000"/>
@@ -714,21 +852,16 @@
               <w:pStyle w:val="Compact"/>
               <w:widowControl/>
               <w:spacing w:before="36" w:after="36"/>
-              <w:rPr>
-                <w:rFonts w:eastAsia="" w:cs=""/>
-                <w:kern w:val="0"/>
-                <w:szCs w:val="24"/>
-                <w:lang w:val="en-US" w:eastAsia="zh-CN" w:bidi="ar-SA"/>
-              </w:rPr>
+              <w:rPr/>
             </w:pPr>
-            <w:hyperlink r:id="rId11">
+            <w:hyperlink r:id="rId15">
               <w:r>
                 <w:rPr>
                   <w:rStyle w:val="Hyperlink"/>
                   <w:rFonts w:eastAsia="" w:cs=""/>
                   <w:kern w:val="0"/>
-                  <w:sz w:val="22"/>
-                  <w:szCs w:val="22"/>
+                  <w:sz w:val="20"/>
+                  <w:szCs w:val="20"/>
                   <w:lang w:val="en-US" w:eastAsia="zh-CN" w:bidi="ar-SA"/>
                 </w:rPr>
                 <w:t>Documentation</w:t>
@@ -738,7 +871,7 @@
         </w:tc>
         <w:tc>
           <w:tcPr>
-            <w:tcW w:w="1383" w:type="dxa"/>
+            <w:tcW w:w="1386" w:type="dxa"/>
             <w:tcBorders>
               <w:start w:val="single" w:sz="4" w:space="0" w:color="000000"/>
               <w:bottom w:val="single" w:sz="4" w:space="0" w:color="000000"/>
@@ -753,8 +886,8 @@
               <w:rPr>
                 <w:rFonts w:ascii="Arial" w:hAnsi="Arial" w:eastAsia="" w:cs=""/>
                 <w:kern w:val="0"/>
-                <w:sz w:val="22"/>
-                <w:szCs w:val="22"/>
+                <w:sz w:val="20"/>
+                <w:szCs w:val="20"/>
                 <w:lang w:val="en-US" w:eastAsia="zh-CN" w:bidi="ar-SA"/>
               </w:rPr>
             </w:pPr>
@@ -762,8 +895,8 @@
               <w:rPr>
                 <w:rFonts w:eastAsia="" w:cs=""/>
                 <w:kern w:val="0"/>
-                <w:sz w:val="22"/>
-                <w:szCs w:val="22"/>
+                <w:sz w:val="20"/>
+                <w:szCs w:val="20"/>
                 <w:lang w:val="en-US" w:eastAsia="zh-CN" w:bidi="ar-SA"/>
               </w:rPr>
             </w:r>
@@ -774,7 +907,7 @@
         <w:trPr/>
         <w:tc>
           <w:tcPr>
-            <w:tcW w:w="2041" w:type="dxa"/>
+            <w:tcW w:w="2038" w:type="dxa"/>
             <w:tcBorders>
               <w:start w:val="single" w:sz="4" w:space="0" w:color="000000"/>
               <w:bottom w:val="single" w:sz="4" w:space="0" w:color="000000"/>
@@ -786,19 +919,16 @@
               <w:widowControl/>
               <w:spacing w:before="36" w:after="36"/>
               <w:rPr>
-                <w:rFonts w:ascii="Arial" w:hAnsi="Arial" w:eastAsia="" w:cs=""/>
-                <w:kern w:val="0"/>
-                <w:sz w:val="22"/>
-                <w:szCs w:val="22"/>
-                <w:lang w:val="en-US" w:eastAsia="zh-CN" w:bidi="ar-SA"/>
+                <w:sz w:val="20"/>
+                <w:szCs w:val="20"/>
               </w:rPr>
             </w:pPr>
             <w:r>
               <w:rPr>
                 <w:rFonts w:eastAsia="" w:cs=""/>
                 <w:kern w:val="0"/>
-                <w:sz w:val="22"/>
-                <w:szCs w:val="22"/>
+                <w:sz w:val="20"/>
+                <w:szCs w:val="20"/>
                 <w:lang w:val="en-US" w:eastAsia="zh-CN" w:bidi="ar-SA"/>
               </w:rPr>
               <w:t>CloudScope-Web</w:t>
@@ -819,19 +949,16 @@
               <w:widowControl/>
               <w:spacing w:before="36" w:after="36"/>
               <w:rPr>
-                <w:rFonts w:ascii="Arial" w:hAnsi="Arial" w:eastAsia="" w:cs=""/>
-                <w:kern w:val="0"/>
-                <w:sz w:val="22"/>
-                <w:szCs w:val="22"/>
-                <w:lang w:val="en-US" w:eastAsia="zh-CN" w:bidi="ar-SA"/>
+                <w:sz w:val="20"/>
+                <w:szCs w:val="20"/>
               </w:rPr>
             </w:pPr>
             <w:r>
               <w:rPr>
                 <w:rFonts w:eastAsia="" w:cs=""/>
                 <w:kern w:val="0"/>
-                <w:sz w:val="22"/>
-                <w:szCs w:val="22"/>
+                <w:sz w:val="20"/>
+                <w:szCs w:val="20"/>
                 <w:lang w:val="en-US" w:eastAsia="zh-CN" w:bidi="ar-SA"/>
               </w:rPr>
               <w:t>Interactive publication of imaging data and results</w:t>
@@ -840,7 +967,99 @@
         </w:tc>
         <w:tc>
           <w:tcPr>
-            <w:tcW w:w="1171" w:type="dxa"/>
+            <w:tcW w:w="1174" w:type="dxa"/>
+            <w:tcBorders>
+              <w:start w:val="single" w:sz="4" w:space="0" w:color="000000"/>
+              <w:bottom w:val="single" w:sz="4" w:space="0" w:color="000000"/>
+            </w:tcBorders>
+          </w:tcPr>
+          <w:p>
+            <w:pPr>
+              <w:pStyle w:val="Compact"/>
+              <w:widowControl/>
+              <w:spacing w:before="36" w:after="36"/>
+              <w:rPr/>
+            </w:pPr>
+            <w:hyperlink r:id="rId16">
+              <w:r>
+                <w:rPr>
+                  <w:rStyle w:val="Hyperlink"/>
+                  <w:rFonts w:eastAsia="" w:cs=""/>
+                  <w:kern w:val="0"/>
+                  <w:sz w:val="20"/>
+                  <w:szCs w:val="20"/>
+                  <w:lang w:val="en-US" w:eastAsia="zh-CN" w:bidi="ar-SA"/>
+                </w:rPr>
+                <w:t>GitHub</w:t>
+              </w:r>
+            </w:hyperlink>
+          </w:p>
+        </w:tc>
+        <w:tc>
+          <w:tcPr>
+            <w:tcW w:w="1797" w:type="dxa"/>
+            <w:tcBorders>
+              <w:start w:val="single" w:sz="4" w:space="0" w:color="000000"/>
+              <w:bottom w:val="single" w:sz="4" w:space="0" w:color="000000"/>
+            </w:tcBorders>
+          </w:tcPr>
+          <w:p>
+            <w:pPr>
+              <w:pStyle w:val="Compact"/>
+              <w:widowControl/>
+              <w:spacing w:before="36" w:after="36"/>
+              <w:rPr/>
+            </w:pPr>
+            <w:hyperlink r:id="rId17">
+              <w:r>
+                <w:rPr>
+                  <w:rStyle w:val="Hyperlink"/>
+                  <w:rFonts w:eastAsia="" w:cs=""/>
+                  <w:kern w:val="0"/>
+                  <w:sz w:val="20"/>
+                  <w:szCs w:val="20"/>
+                  <w:lang w:val="en-US" w:eastAsia="zh-CN" w:bidi="ar-SA"/>
+                </w:rPr>
+                <w:t>Documentation</w:t>
+              </w:r>
+            </w:hyperlink>
+          </w:p>
+        </w:tc>
+        <w:tc>
+          <w:tcPr>
+            <w:tcW w:w="1386" w:type="dxa"/>
+            <w:tcBorders>
+              <w:start w:val="single" w:sz="4" w:space="0" w:color="000000"/>
+              <w:bottom w:val="single" w:sz="4" w:space="0" w:color="000000"/>
+              <w:end w:val="single" w:sz="4" w:space="0" w:color="000000"/>
+            </w:tcBorders>
+          </w:tcPr>
+          <w:p>
+            <w:pPr>
+              <w:pStyle w:val="Compact"/>
+              <w:widowControl/>
+              <w:spacing w:before="36" w:after="36"/>
+              <w:rPr/>
+            </w:pPr>
+            <w:r>
+              <w:rPr>
+                <w:rStyle w:val="Hyperlink"/>
+                <w:rFonts w:eastAsia="" w:cs=""/>
+                <w:kern w:val="0"/>
+                <w:sz w:val="20"/>
+                <w:szCs w:val="20"/>
+                <w:lang w:val="en-US" w:eastAsia="zh-CN" w:bidi="ar-SA"/>
+              </w:rPr>
+              <w:t>Web App</w:t>
+            </w:r>
+          </w:p>
+        </w:tc>
+      </w:tr>
+      <w:tr>
+        <w:trPr/>
+        <w:tc>
+          <w:tcPr>
+            <w:tcW w:w="2038" w:type="dxa"/>
             <w:tcBorders>
               <w:start w:val="single" w:sz="4" w:space="0" w:color="000000"/>
               <w:bottom w:val="single" w:sz="4" w:space="0" w:color="000000"/>
@@ -852,126 +1071,16 @@
               <w:widowControl/>
               <w:spacing w:before="36" w:after="36"/>
               <w:rPr>
-                <w:rFonts w:eastAsia="" w:cs=""/>
-                <w:kern w:val="0"/>
-                <w:szCs w:val="24"/>
-                <w:lang w:val="en-US" w:eastAsia="zh-CN" w:bidi="ar-SA"/>
-              </w:rPr>
-            </w:pPr>
-            <w:hyperlink r:id="rId12">
-              <w:r>
-                <w:rPr>
-                  <w:rStyle w:val="Hyperlink"/>
-                  <w:rFonts w:eastAsia="" w:cs=""/>
-                  <w:kern w:val="0"/>
-                  <w:sz w:val="22"/>
-                  <w:szCs w:val="22"/>
-                  <w:lang w:val="en-US" w:eastAsia="zh-CN" w:bidi="ar-SA"/>
-                </w:rPr>
-                <w:t>GitHub</w:t>
-              </w:r>
-            </w:hyperlink>
-          </w:p>
-        </w:tc>
-        <w:tc>
-          <w:tcPr>
-            <w:tcW w:w="1800" w:type="dxa"/>
-            <w:tcBorders>
-              <w:start w:val="single" w:sz="4" w:space="0" w:color="000000"/>
-              <w:bottom w:val="single" w:sz="4" w:space="0" w:color="000000"/>
-            </w:tcBorders>
-          </w:tcPr>
-          <w:p>
-            <w:pPr>
-              <w:pStyle w:val="Compact"/>
-              <w:widowControl/>
-              <w:spacing w:before="36" w:after="36"/>
-              <w:rPr>
-                <w:rFonts w:eastAsia="" w:cs=""/>
-                <w:kern w:val="0"/>
-                <w:szCs w:val="24"/>
-                <w:lang w:val="en-US" w:eastAsia="zh-CN" w:bidi="ar-SA"/>
-              </w:rPr>
-            </w:pPr>
-            <w:hyperlink r:id="rId13">
-              <w:r>
-                <w:rPr>
-                  <w:rStyle w:val="Hyperlink"/>
-                  <w:rFonts w:eastAsia="" w:cs=""/>
-                  <w:kern w:val="0"/>
-                  <w:sz w:val="22"/>
-                  <w:szCs w:val="22"/>
-                  <w:lang w:val="en-US" w:eastAsia="zh-CN" w:bidi="ar-SA"/>
-                </w:rPr>
-                <w:t>Documentation</w:t>
-              </w:r>
-            </w:hyperlink>
-          </w:p>
-        </w:tc>
-        <w:tc>
-          <w:tcPr>
-            <w:tcW w:w="1383" w:type="dxa"/>
-            <w:tcBorders>
-              <w:start w:val="single" w:sz="4" w:space="0" w:color="000000"/>
-              <w:bottom w:val="single" w:sz="4" w:space="0" w:color="000000"/>
-              <w:end w:val="single" w:sz="4" w:space="0" w:color="000000"/>
-            </w:tcBorders>
-          </w:tcPr>
-          <w:p>
-            <w:pPr>
-              <w:pStyle w:val="Compact"/>
-              <w:widowControl/>
-              <w:spacing w:before="36" w:after="36"/>
-              <w:rPr>
-                <w:rFonts w:eastAsia="" w:cs=""/>
-                <w:kern w:val="0"/>
-                <w:szCs w:val="24"/>
-                <w:lang w:val="en-US" w:eastAsia="zh-CN" w:bidi="ar-SA"/>
-              </w:rPr>
-            </w:pPr>
-            <w:r>
-              <w:rPr>
-                <w:rStyle w:val="Hyperlink"/>
-                <w:rFonts w:eastAsia="" w:cs=""/>
-                <w:kern w:val="0"/>
-                <w:sz w:val="22"/>
-                <w:szCs w:val="22"/>
-                <w:lang w:val="en-US" w:eastAsia="zh-CN" w:bidi="ar-SA"/>
-              </w:rPr>
-              <w:t>Web App</w:t>
-            </w:r>
-          </w:p>
-        </w:tc>
-      </w:tr>
-      <w:tr>
-        <w:trPr/>
-        <w:tc>
-          <w:tcPr>
-            <w:tcW w:w="2041" w:type="dxa"/>
-            <w:tcBorders>
-              <w:start w:val="single" w:sz="4" w:space="0" w:color="000000"/>
-              <w:bottom w:val="single" w:sz="4" w:space="0" w:color="000000"/>
-            </w:tcBorders>
-          </w:tcPr>
-          <w:p>
-            <w:pPr>
-              <w:pStyle w:val="Compact"/>
-              <w:widowControl/>
-              <w:spacing w:before="36" w:after="36"/>
-              <w:rPr>
-                <w:rFonts w:ascii="Arial" w:hAnsi="Arial" w:eastAsia="" w:cs=""/>
-                <w:kern w:val="0"/>
-                <w:sz w:val="22"/>
-                <w:szCs w:val="22"/>
-                <w:lang w:val="en-US" w:eastAsia="zh-CN" w:bidi="ar-SA"/>
+                <w:sz w:val="20"/>
+                <w:szCs w:val="20"/>
               </w:rPr>
             </w:pPr>
             <w:r>
               <w:rPr>
                 <w:rFonts w:eastAsia="" w:cs=""/>
                 <w:kern w:val="0"/>
-                <w:sz w:val="22"/>
-                <w:szCs w:val="22"/>
+                <w:sz w:val="20"/>
+                <w:szCs w:val="20"/>
                 <w:lang w:val="en-US" w:eastAsia="zh-CN" w:bidi="ar-SA"/>
               </w:rPr>
               <w:t>SanPy</w:t>
@@ -992,19 +1101,16 @@
               <w:widowControl/>
               <w:spacing w:before="36" w:after="36"/>
               <w:rPr>
-                <w:rFonts w:ascii="Arial" w:hAnsi="Arial" w:eastAsia="" w:cs=""/>
-                <w:kern w:val="0"/>
-                <w:sz w:val="22"/>
-                <w:szCs w:val="22"/>
-                <w:lang w:val="en-US" w:eastAsia="zh-CN" w:bidi="ar-SA"/>
+                <w:sz w:val="20"/>
+                <w:szCs w:val="20"/>
               </w:rPr>
             </w:pPr>
             <w:r>
               <w:rPr>
                 <w:rFonts w:eastAsia="" w:cs=""/>
                 <w:kern w:val="0"/>
-                <w:sz w:val="22"/>
-                <w:szCs w:val="22"/>
+                <w:sz w:val="20"/>
+                <w:szCs w:val="20"/>
                 <w:lang w:val="en-US" w:eastAsia="zh-CN" w:bidi="ar-SA"/>
               </w:rPr>
               <w:t>Electrophysiology analysis and visualization</w:t>
@@ -1013,7 +1119,7 @@
         </w:tc>
         <w:tc>
           <w:tcPr>
-            <w:tcW w:w="1171" w:type="dxa"/>
+            <w:tcW w:w="1174" w:type="dxa"/>
             <w:tcBorders>
               <w:start w:val="single" w:sz="4" w:space="0" w:color="000000"/>
               <w:bottom w:val="single" w:sz="4" w:space="0" w:color="000000"/>
@@ -1024,21 +1130,16 @@
               <w:pStyle w:val="Compact"/>
               <w:widowControl/>
               <w:spacing w:before="36" w:after="36"/>
-              <w:rPr>
-                <w:rFonts w:eastAsia="" w:cs=""/>
-                <w:kern w:val="0"/>
-                <w:szCs w:val="24"/>
-                <w:lang w:val="en-US" w:eastAsia="zh-CN" w:bidi="ar-SA"/>
-              </w:rPr>
+              <w:rPr/>
             </w:pPr>
-            <w:hyperlink r:id="rId14">
+            <w:hyperlink r:id="rId18">
               <w:r>
                 <w:rPr>
                   <w:rStyle w:val="Hyperlink"/>
                   <w:rFonts w:eastAsia="" w:cs=""/>
                   <w:kern w:val="0"/>
-                  <w:sz w:val="22"/>
-                  <w:szCs w:val="22"/>
+                  <w:sz w:val="20"/>
+                  <w:szCs w:val="20"/>
                   <w:lang w:val="en-US" w:eastAsia="zh-CN" w:bidi="ar-SA"/>
                 </w:rPr>
                 <w:t>GitHub</w:t>
@@ -1048,7 +1149,7 @@
         </w:tc>
         <w:tc>
           <w:tcPr>
-            <w:tcW w:w="1800" w:type="dxa"/>
+            <w:tcW w:w="1797" w:type="dxa"/>
             <w:tcBorders>
               <w:start w:val="single" w:sz="4" w:space="0" w:color="000000"/>
               <w:bottom w:val="single" w:sz="4" w:space="0" w:color="000000"/>
@@ -1059,21 +1160,16 @@
               <w:pStyle w:val="Compact"/>
               <w:widowControl/>
               <w:spacing w:before="36" w:after="36"/>
-              <w:rPr>
-                <w:rFonts w:eastAsia="" w:cs=""/>
-                <w:kern w:val="0"/>
-                <w:szCs w:val="24"/>
-                <w:lang w:val="en-US" w:eastAsia="zh-CN" w:bidi="ar-SA"/>
-              </w:rPr>
+              <w:rPr/>
             </w:pPr>
-            <w:hyperlink r:id="rId15">
+            <w:hyperlink r:id="rId19">
               <w:r>
                 <w:rPr>
                   <w:rStyle w:val="Hyperlink"/>
                   <w:rFonts w:eastAsia="" w:cs=""/>
                   <w:kern w:val="0"/>
-                  <w:sz w:val="22"/>
-                  <w:szCs w:val="22"/>
+                  <w:sz w:val="20"/>
+                  <w:szCs w:val="20"/>
                   <w:lang w:val="en-US" w:eastAsia="zh-CN" w:bidi="ar-SA"/>
                 </w:rPr>
                 <w:t>Documentation</w:t>
@@ -1083,7 +1179,7 @@
         </w:tc>
         <w:tc>
           <w:tcPr>
-            <w:tcW w:w="1383" w:type="dxa"/>
+            <w:tcW w:w="1386" w:type="dxa"/>
             <w:tcBorders>
               <w:start w:val="single" w:sz="4" w:space="0" w:color="000000"/>
               <w:bottom w:val="single" w:sz="4" w:space="0" w:color="000000"/>
@@ -1098,8 +1194,8 @@
               <w:rPr>
                 <w:rFonts w:ascii="Arial" w:hAnsi="Arial" w:eastAsia="" w:cs=""/>
                 <w:kern w:val="0"/>
-                <w:sz w:val="22"/>
-                <w:szCs w:val="22"/>
+                <w:sz w:val="20"/>
+                <w:szCs w:val="20"/>
                 <w:lang w:val="en-US" w:eastAsia="zh-CN" w:bidi="ar-SA"/>
               </w:rPr>
             </w:pPr>
@@ -1107,8 +1203,8 @@
               <w:rPr>
                 <w:rFonts w:eastAsia="" w:cs=""/>
                 <w:kern w:val="0"/>
-                <w:sz w:val="22"/>
-                <w:szCs w:val="22"/>
+                <w:sz w:val="20"/>
+                <w:szCs w:val="20"/>
                 <w:lang w:val="en-US" w:eastAsia="zh-CN" w:bidi="ar-SA"/>
               </w:rPr>
             </w:r>
@@ -1119,7 +1215,7 @@
         <w:trPr/>
         <w:tc>
           <w:tcPr>
-            <w:tcW w:w="2041" w:type="dxa"/>
+            <w:tcW w:w="2038" w:type="dxa"/>
             <w:tcBorders>
               <w:start w:val="single" w:sz="4" w:space="0" w:color="000000"/>
               <w:bottom w:val="single" w:sz="4" w:space="0" w:color="000000"/>
@@ -1131,17 +1227,16 @@
               <w:widowControl/>
               <w:spacing w:before="36" w:after="36"/>
               <w:rPr>
-                <w:rFonts w:eastAsia="" w:cs=""/>
-                <w:kern w:val="0"/>
-                <w:szCs w:val="24"/>
-                <w:lang w:val="en-US" w:eastAsia="zh-CN" w:bidi="ar-SA"/>
+                <w:sz w:val="20"/>
+                <w:szCs w:val="20"/>
               </w:rPr>
             </w:pPr>
             <w:r>
               <w:rPr>
                 <w:rFonts w:eastAsia="" w:cs=""/>
                 <w:kern w:val="0"/>
-                <w:szCs w:val="24"/>
+                <w:sz w:val="20"/>
+                <w:szCs w:val="20"/>
                 <w:lang w:val="en-US" w:eastAsia="zh-CN" w:bidi="ar-SA"/>
               </w:rPr>
               <w:t>MapManager</w:t>
@@ -1162,17 +1257,16 @@
               <w:widowControl/>
               <w:spacing w:before="36" w:after="36"/>
               <w:rPr>
-                <w:rFonts w:eastAsia="" w:cs=""/>
-                <w:kern w:val="0"/>
-                <w:szCs w:val="24"/>
-                <w:lang w:val="en-US" w:eastAsia="zh-CN" w:bidi="ar-SA"/>
+                <w:sz w:val="20"/>
+                <w:szCs w:val="20"/>
               </w:rPr>
             </w:pPr>
             <w:r>
               <w:rPr>
                 <w:rFonts w:eastAsia="" w:cs=""/>
                 <w:kern w:val="0"/>
-                <w:szCs w:val="24"/>
+                <w:sz w:val="20"/>
+                <w:szCs w:val="20"/>
                 <w:lang w:val="en-US" w:eastAsia="zh-CN" w:bidi="ar-SA"/>
               </w:rPr>
               <w:t>Longitudinal analysis of neuronal structure</w:t>
@@ -1181,7 +1275,112 @@
         </w:tc>
         <w:tc>
           <w:tcPr>
-            <w:tcW w:w="1171" w:type="dxa"/>
+            <w:tcW w:w="1174" w:type="dxa"/>
+            <w:tcBorders>
+              <w:start w:val="single" w:sz="4" w:space="0" w:color="000000"/>
+              <w:bottom w:val="single" w:sz="4" w:space="0" w:color="000000"/>
+            </w:tcBorders>
+          </w:tcPr>
+          <w:p>
+            <w:pPr>
+              <w:pStyle w:val="Compact"/>
+              <w:widowControl/>
+              <w:spacing w:before="36" w:after="36"/>
+              <w:rPr/>
+            </w:pPr>
+            <w:hyperlink r:id="rId20">
+              <w:r>
+                <w:rPr>
+                  <w:rStyle w:val="Hyperlink"/>
+                  <w:rFonts w:eastAsia="" w:cs=""/>
+                  <w:kern w:val="0"/>
+                  <w:sz w:val="20"/>
+                  <w:szCs w:val="20"/>
+                  <w:lang w:val="en-US" w:eastAsia="zh-CN" w:bidi="ar-SA"/>
+                </w:rPr>
+                <w:t>GitHub</w:t>
+              </w:r>
+            </w:hyperlink>
+          </w:p>
+        </w:tc>
+        <w:tc>
+          <w:tcPr>
+            <w:tcW w:w="1797" w:type="dxa"/>
+            <w:tcBorders>
+              <w:start w:val="single" w:sz="4" w:space="0" w:color="000000"/>
+              <w:bottom w:val="single" w:sz="4" w:space="0" w:color="000000"/>
+            </w:tcBorders>
+          </w:tcPr>
+          <w:p>
+            <w:pPr>
+              <w:pStyle w:val="Compact"/>
+              <w:widowControl/>
+              <w:spacing w:before="36" w:after="36"/>
+              <w:rPr/>
+            </w:pPr>
+            <w:hyperlink r:id="rId21">
+              <w:r>
+                <w:rPr>
+                  <w:rStyle w:val="Hyperlink"/>
+                  <w:rFonts w:eastAsia="" w:cs=""/>
+                  <w:kern w:val="0"/>
+                  <w:sz w:val="20"/>
+                  <w:szCs w:val="20"/>
+                  <w:lang w:val="en-US" w:eastAsia="zh-CN" w:bidi="ar-SA"/>
+                </w:rPr>
+                <w:t>Documentation</w:t>
+              </w:r>
+            </w:hyperlink>
+          </w:p>
+        </w:tc>
+        <w:tc>
+          <w:tcPr>
+            <w:tcW w:w="1386" w:type="dxa"/>
+            <w:tcBorders>
+              <w:start w:val="single" w:sz="4" w:space="0" w:color="000000"/>
+              <w:bottom w:val="single" w:sz="4" w:space="0" w:color="000000"/>
+              <w:end w:val="single" w:sz="4" w:space="0" w:color="000000"/>
+            </w:tcBorders>
+          </w:tcPr>
+          <w:p>
+            <w:pPr>
+              <w:pStyle w:val="Compact"/>
+              <w:widowControl/>
+              <w:spacing w:before="36" w:after="36"/>
+              <w:rPr/>
+            </w:pPr>
+            <w:hyperlink r:id="rId22">
+              <w:r>
+                <w:rPr>
+                  <w:rStyle w:val="Hyperlink"/>
+                  <w:rFonts w:eastAsia="" w:cs=""/>
+                  <w:kern w:val="0"/>
+                  <w:sz w:val="20"/>
+                  <w:szCs w:val="20"/>
+                  <w:lang w:val="en-US" w:eastAsia="zh-CN" w:bidi="ar-SA"/>
+                </w:rPr>
+                <w:t>W</w:t>
+              </w:r>
+            </w:hyperlink>
+            <w:r>
+              <w:rPr>
+                <w:rStyle w:val="Hyperlink"/>
+                <w:rFonts w:eastAsia="" w:cs=""/>
+                <w:kern w:val="0"/>
+                <w:sz w:val="20"/>
+                <w:szCs w:val="20"/>
+                <w:lang w:val="en-US" w:eastAsia="zh-CN" w:bidi="ar-SA"/>
+              </w:rPr>
+              <w:t>eb App</w:t>
+            </w:r>
+          </w:p>
+        </w:tc>
+      </w:tr>
+      <w:tr>
+        <w:trPr/>
+        <w:tc>
+          <w:tcPr>
+            <w:tcW w:w="2038" w:type="dxa"/>
             <w:tcBorders>
               <w:start w:val="single" w:sz="4" w:space="0" w:color="000000"/>
               <w:bottom w:val="single" w:sz="4" w:space="0" w:color="000000"/>
@@ -1193,133 +1392,16 @@
               <w:widowControl/>
               <w:spacing w:before="36" w:after="36"/>
               <w:rPr>
-                <w:rFonts w:eastAsia="" w:cs=""/>
-                <w:kern w:val="0"/>
-                <w:szCs w:val="24"/>
-                <w:lang w:val="en-US" w:eastAsia="zh-CN" w:bidi="ar-SA"/>
-              </w:rPr>
-            </w:pPr>
-            <w:hyperlink r:id="rId16">
-              <w:r>
-                <w:rPr>
-                  <w:rStyle w:val="Hyperlink"/>
-                  <w:rFonts w:eastAsia="" w:cs=""/>
-                  <w:kern w:val="0"/>
-                  <w:szCs w:val="24"/>
-                  <w:lang w:val="en-US" w:eastAsia="zh-CN" w:bidi="ar-SA"/>
-                </w:rPr>
-                <w:t>GitHub</w:t>
-              </w:r>
-            </w:hyperlink>
-          </w:p>
-        </w:tc>
-        <w:tc>
-          <w:tcPr>
-            <w:tcW w:w="1800" w:type="dxa"/>
-            <w:tcBorders>
-              <w:start w:val="single" w:sz="4" w:space="0" w:color="000000"/>
-              <w:bottom w:val="single" w:sz="4" w:space="0" w:color="000000"/>
-            </w:tcBorders>
-          </w:tcPr>
-          <w:p>
-            <w:pPr>
-              <w:pStyle w:val="Compact"/>
-              <w:widowControl/>
-              <w:spacing w:before="36" w:after="36"/>
-              <w:rPr>
-                <w:rFonts w:eastAsia="" w:cs=""/>
-                <w:kern w:val="0"/>
-                <w:szCs w:val="24"/>
-                <w:lang w:val="en-US" w:eastAsia="zh-CN" w:bidi="ar-SA"/>
-              </w:rPr>
-            </w:pPr>
-            <w:hyperlink r:id="rId17">
-              <w:r>
-                <w:rPr>
-                  <w:rStyle w:val="Hyperlink"/>
-                  <w:rFonts w:eastAsia="" w:cs=""/>
-                  <w:kern w:val="0"/>
-                  <w:szCs w:val="24"/>
-                  <w:lang w:val="en-US" w:eastAsia="zh-CN" w:bidi="ar-SA"/>
-                </w:rPr>
-                <w:t>Documentation</w:t>
-              </w:r>
-            </w:hyperlink>
-          </w:p>
-        </w:tc>
-        <w:tc>
-          <w:tcPr>
-            <w:tcW w:w="1383" w:type="dxa"/>
-            <w:tcBorders>
-              <w:start w:val="single" w:sz="4" w:space="0" w:color="000000"/>
-              <w:bottom w:val="single" w:sz="4" w:space="0" w:color="000000"/>
-              <w:end w:val="single" w:sz="4" w:space="0" w:color="000000"/>
-            </w:tcBorders>
-          </w:tcPr>
-          <w:p>
-            <w:pPr>
-              <w:pStyle w:val="Compact"/>
-              <w:widowControl/>
-              <w:spacing w:before="36" w:after="36"/>
-              <w:rPr>
-                <w:rFonts w:eastAsia="" w:cs=""/>
-                <w:kern w:val="0"/>
-                <w:szCs w:val="24"/>
-                <w:lang w:val="en-US" w:eastAsia="zh-CN" w:bidi="ar-SA"/>
-              </w:rPr>
-            </w:pPr>
-            <w:hyperlink r:id="rId18">
-              <w:r>
-                <w:rPr>
-                  <w:rStyle w:val="Hyperlink"/>
-                  <w:rFonts w:eastAsia="" w:cs=""/>
-                  <w:kern w:val="0"/>
-                  <w:szCs w:val="24"/>
-                  <w:lang w:val="en-US" w:eastAsia="zh-CN" w:bidi="ar-SA"/>
-                </w:rPr>
-                <w:t>W</w:t>
-              </w:r>
-            </w:hyperlink>
-            <w:r>
-              <w:rPr>
-                <w:rStyle w:val="Hyperlink"/>
-                <w:rFonts w:eastAsia="" w:cs=""/>
-                <w:kern w:val="0"/>
-                <w:szCs w:val="24"/>
-                <w:lang w:val="en-US" w:eastAsia="zh-CN" w:bidi="ar-SA"/>
-              </w:rPr>
-              <w:t>eb App</w:t>
-            </w:r>
-          </w:p>
-        </w:tc>
-      </w:tr>
-      <w:tr>
-        <w:trPr/>
-        <w:tc>
-          <w:tcPr>
-            <w:tcW w:w="2041" w:type="dxa"/>
-            <w:tcBorders>
-              <w:start w:val="single" w:sz="4" w:space="0" w:color="000000"/>
-              <w:bottom w:val="single" w:sz="4" w:space="0" w:color="000000"/>
-            </w:tcBorders>
-          </w:tcPr>
-          <w:p>
-            <w:pPr>
-              <w:pStyle w:val="Compact"/>
-              <w:widowControl/>
-              <w:spacing w:before="36" w:after="36"/>
-              <w:rPr>
-                <w:rFonts w:eastAsia="" w:cs=""/>
-                <w:kern w:val="0"/>
-                <w:szCs w:val="24"/>
-                <w:lang w:val="en-US" w:eastAsia="zh-CN" w:bidi="ar-SA"/>
+                <w:sz w:val="20"/>
+                <w:szCs w:val="20"/>
               </w:rPr>
             </w:pPr>
             <w:r>
               <w:rPr>
                 <w:rFonts w:eastAsia="" w:cs=""/>
                 <w:kern w:val="0"/>
-                <w:szCs w:val="24"/>
+                <w:sz w:val="20"/>
+                <w:szCs w:val="20"/>
                 <w:lang w:val="en-US" w:eastAsia="zh-CN" w:bidi="ar-SA"/>
               </w:rPr>
               <w:t>PiE</w:t>
@@ -1340,17 +1422,16 @@
               <w:widowControl/>
               <w:spacing w:before="36" w:after="36"/>
               <w:rPr>
-                <w:rFonts w:eastAsia="" w:cs=""/>
-                <w:kern w:val="0"/>
-                <w:szCs w:val="24"/>
-                <w:lang w:val="en-US" w:eastAsia="zh-CN" w:bidi="ar-SA"/>
+                <w:sz w:val="20"/>
+                <w:szCs w:val="20"/>
               </w:rPr>
             </w:pPr>
             <w:r>
               <w:rPr>
                 <w:rFonts w:eastAsia="" w:cs=""/>
                 <w:kern w:val="0"/>
-                <w:szCs w:val="24"/>
+                <w:sz w:val="20"/>
+                <w:szCs w:val="20"/>
                 <w:lang w:val="en-US" w:eastAsia="zh-CN" w:bidi="ar-SA"/>
               </w:rPr>
               <w:t>Remote control and monitoring of behavioral experiments</w:t>
@@ -1359,7 +1440,7 @@
         </w:tc>
         <w:tc>
           <w:tcPr>
-            <w:tcW w:w="1171" w:type="dxa"/>
+            <w:tcW w:w="1174" w:type="dxa"/>
             <w:tcBorders>
               <w:start w:val="single" w:sz="4" w:space="0" w:color="000000"/>
               <w:bottom w:val="single" w:sz="4" w:space="0" w:color="000000"/>
@@ -1370,20 +1451,16 @@
               <w:pStyle w:val="Compact"/>
               <w:widowControl/>
               <w:spacing w:before="36" w:after="36"/>
-              <w:rPr>
-                <w:rFonts w:eastAsia="" w:cs=""/>
-                <w:kern w:val="0"/>
-                <w:szCs w:val="24"/>
-                <w:lang w:val="en-US" w:eastAsia="zh-CN" w:bidi="ar-SA"/>
-              </w:rPr>
+              <w:rPr/>
             </w:pPr>
-            <w:hyperlink r:id="rId19">
+            <w:hyperlink r:id="rId23">
               <w:r>
                 <w:rPr>
                   <w:rStyle w:val="Hyperlink"/>
                   <w:rFonts w:eastAsia="" w:cs=""/>
                   <w:kern w:val="0"/>
-                  <w:szCs w:val="24"/>
+                  <w:sz w:val="20"/>
+                  <w:szCs w:val="20"/>
                   <w:lang w:val="en-US" w:eastAsia="zh-CN" w:bidi="ar-SA"/>
                 </w:rPr>
                 <w:t>GitHub</w:t>
@@ -1393,7 +1470,7 @@
         </w:tc>
         <w:tc>
           <w:tcPr>
-            <w:tcW w:w="1800" w:type="dxa"/>
+            <w:tcW w:w="1797" w:type="dxa"/>
             <w:tcBorders>
               <w:start w:val="single" w:sz="4" w:space="0" w:color="000000"/>
               <w:bottom w:val="single" w:sz="4" w:space="0" w:color="000000"/>
@@ -1404,20 +1481,16 @@
               <w:pStyle w:val="Compact"/>
               <w:widowControl/>
               <w:spacing w:before="36" w:after="36"/>
-              <w:rPr>
-                <w:rFonts w:eastAsia="" w:cs=""/>
-                <w:kern w:val="0"/>
-                <w:szCs w:val="24"/>
-                <w:lang w:val="en-US" w:eastAsia="zh-CN" w:bidi="ar-SA"/>
-              </w:rPr>
+              <w:rPr/>
             </w:pPr>
-            <w:hyperlink r:id="rId20">
+            <w:hyperlink r:id="rId24">
               <w:r>
                 <w:rPr>
                   <w:rStyle w:val="Hyperlink"/>
                   <w:rFonts w:eastAsia="" w:cs=""/>
                   <w:kern w:val="0"/>
-                  <w:szCs w:val="24"/>
+                  <w:sz w:val="20"/>
+                  <w:szCs w:val="20"/>
                   <w:lang w:val="en-US" w:eastAsia="zh-CN" w:bidi="ar-SA"/>
                 </w:rPr>
                 <w:t>Documentation</w:t>
@@ -1427,7 +1500,7 @@
         </w:tc>
         <w:tc>
           <w:tcPr>
-            <w:tcW w:w="1383" w:type="dxa"/>
+            <w:tcW w:w="1386" w:type="dxa"/>
             <w:tcBorders>
               <w:start w:val="single" w:sz="4" w:space="0" w:color="000000"/>
               <w:bottom w:val="single" w:sz="4" w:space="0" w:color="000000"/>
@@ -1442,7 +1515,8 @@
               <w:rPr>
                 <w:rFonts w:eastAsia="" w:cs=""/>
                 <w:kern w:val="0"/>
-                <w:szCs w:val="24"/>
+                <w:sz w:val="20"/>
+                <w:szCs w:val="20"/>
                 <w:lang w:val="en-US" w:eastAsia="zh-CN" w:bidi="ar-SA"/>
               </w:rPr>
             </w:pPr>
@@ -1450,7 +1524,8 @@
               <w:rPr>
                 <w:rFonts w:eastAsia="" w:cs=""/>
                 <w:kern w:val="0"/>
-                <w:szCs w:val="24"/>
+                <w:sz w:val="20"/>
+                <w:szCs w:val="20"/>
                 <w:lang w:val="en-US" w:eastAsia="zh-CN" w:bidi="ar-SA"/>
               </w:rPr>
             </w:r>
@@ -1461,7 +1536,7 @@
         <w:trPr/>
         <w:tc>
           <w:tcPr>
-            <w:tcW w:w="2041" w:type="dxa"/>
+            <w:tcW w:w="2038" w:type="dxa"/>
             <w:tcBorders>
               <w:start w:val="single" w:sz="4" w:space="0" w:color="000000"/>
               <w:bottom w:val="single" w:sz="4" w:space="0" w:color="000000"/>
@@ -1473,17 +1548,16 @@
               <w:widowControl/>
               <w:spacing w:before="36" w:after="36"/>
               <w:rPr>
-                <w:rFonts w:eastAsia="" w:cs=""/>
-                <w:kern w:val="0"/>
-                <w:szCs w:val="24"/>
-                <w:lang w:val="en-US" w:eastAsia="zh-CN" w:bidi="ar-SA"/>
+                <w:sz w:val="20"/>
+                <w:szCs w:val="20"/>
               </w:rPr>
             </w:pPr>
             <w:r>
               <w:rPr>
                 <w:rFonts w:eastAsia="" w:cs=""/>
                 <w:kern w:val="0"/>
-                <w:szCs w:val="24"/>
+                <w:sz w:val="20"/>
+                <w:szCs w:val="20"/>
                 <w:lang w:val="en-US" w:eastAsia="zh-CN" w:bidi="ar-SA"/>
               </w:rPr>
               <w:t>Brightest Path</w:t>
@@ -1504,17 +1578,16 @@
               <w:widowControl/>
               <w:spacing w:before="36" w:after="36"/>
               <w:rPr>
-                <w:rFonts w:eastAsia="" w:cs=""/>
-                <w:kern w:val="0"/>
-                <w:szCs w:val="24"/>
-                <w:lang w:val="en-US" w:eastAsia="zh-CN" w:bidi="ar-SA"/>
+                <w:sz w:val="20"/>
+                <w:szCs w:val="20"/>
               </w:rPr>
             </w:pPr>
             <w:r>
               <w:rPr>
                 <w:rFonts w:eastAsia="" w:cs=""/>
                 <w:kern w:val="0"/>
-                <w:szCs w:val="24"/>
+                <w:sz w:val="20"/>
+                <w:szCs w:val="20"/>
                 <w:lang w:val="en-US" w:eastAsia="zh-CN" w:bidi="ar-SA"/>
               </w:rPr>
               <w:t>Reusable path tracing for n-dimensional images</w:t>
@@ -1523,7 +1596,7 @@
         </w:tc>
         <w:tc>
           <w:tcPr>
-            <w:tcW w:w="1171" w:type="dxa"/>
+            <w:tcW w:w="1174" w:type="dxa"/>
             <w:tcBorders>
               <w:start w:val="single" w:sz="4" w:space="0" w:color="000000"/>
               <w:bottom w:val="single" w:sz="4" w:space="0" w:color="000000"/>
@@ -1534,20 +1607,16 @@
               <w:pStyle w:val="Compact"/>
               <w:widowControl/>
               <w:spacing w:before="36" w:after="36"/>
-              <w:rPr>
-                <w:rFonts w:eastAsia="" w:cs=""/>
-                <w:kern w:val="0"/>
-                <w:szCs w:val="24"/>
-                <w:lang w:val="en-US" w:eastAsia="zh-CN" w:bidi="ar-SA"/>
-              </w:rPr>
+              <w:rPr/>
             </w:pPr>
-            <w:hyperlink r:id="rId21">
+            <w:hyperlink r:id="rId25">
               <w:r>
                 <w:rPr>
                   <w:rStyle w:val="Hyperlink"/>
                   <w:rFonts w:eastAsia="" w:cs=""/>
                   <w:kern w:val="0"/>
-                  <w:szCs w:val="24"/>
+                  <w:sz w:val="20"/>
+                  <w:szCs w:val="20"/>
                   <w:lang w:val="en-US" w:eastAsia="zh-CN" w:bidi="ar-SA"/>
                 </w:rPr>
                 <w:t>GitHub</w:t>
@@ -1557,7 +1626,7 @@
         </w:tc>
         <w:tc>
           <w:tcPr>
-            <w:tcW w:w="1800" w:type="dxa"/>
+            <w:tcW w:w="1797" w:type="dxa"/>
             <w:tcBorders>
               <w:start w:val="single" w:sz="4" w:space="0" w:color="000000"/>
               <w:bottom w:val="single" w:sz="4" w:space="0" w:color="000000"/>
@@ -1568,20 +1637,16 @@
               <w:pStyle w:val="Compact"/>
               <w:widowControl/>
               <w:spacing w:before="36" w:after="36"/>
-              <w:rPr>
-                <w:rFonts w:eastAsia="" w:cs=""/>
-                <w:kern w:val="0"/>
-                <w:szCs w:val="24"/>
-                <w:lang w:val="en-US" w:eastAsia="zh-CN" w:bidi="ar-SA"/>
-              </w:rPr>
+              <w:rPr/>
             </w:pPr>
-            <w:hyperlink r:id="rId22">
+            <w:hyperlink r:id="rId26">
               <w:r>
                 <w:rPr>
                   <w:rStyle w:val="Hyperlink"/>
                   <w:rFonts w:eastAsia="" w:cs=""/>
                   <w:kern w:val="0"/>
-                  <w:szCs w:val="24"/>
+                  <w:sz w:val="20"/>
+                  <w:szCs w:val="20"/>
                   <w:lang w:val="en-US" w:eastAsia="zh-CN" w:bidi="ar-SA"/>
                 </w:rPr>
                 <w:t>Documentation</w:t>
@@ -1591,7 +1656,7 @@
         </w:tc>
         <w:tc>
           <w:tcPr>
-            <w:tcW w:w="1383" w:type="dxa"/>
+            <w:tcW w:w="1386" w:type="dxa"/>
             <w:tcBorders>
               <w:start w:val="single" w:sz="4" w:space="0" w:color="000000"/>
               <w:bottom w:val="single" w:sz="4" w:space="0" w:color="000000"/>
@@ -1606,7 +1671,8 @@
               <w:rPr>
                 <w:rFonts w:eastAsia="" w:cs=""/>
                 <w:kern w:val="0"/>
-                <w:szCs w:val="24"/>
+                <w:sz w:val="20"/>
+                <w:szCs w:val="20"/>
                 <w:lang w:val="en-US" w:eastAsia="zh-CN" w:bidi="ar-SA"/>
               </w:rPr>
             </w:pPr>
@@ -1614,14 +1680,15 @@
               <w:rPr>
                 <w:rFonts w:eastAsia="" w:cs=""/>
                 <w:kern w:val="0"/>
-                <w:szCs w:val="24"/>
+                <w:sz w:val="20"/>
+                <w:szCs w:val="20"/>
                 <w:lang w:val="en-US" w:eastAsia="zh-CN" w:bidi="ar-SA"/>
               </w:rPr>
             </w:r>
-            <w:bookmarkStart w:id="6" w:name="project-resources"/>
             <w:bookmarkStart w:id="7" w:name="research-software-platforms"/>
-            <w:bookmarkEnd w:id="6"/>
+            <w:bookmarkStart w:id="8" w:name="project-resources"/>
             <w:bookmarkEnd w:id="7"/>
+            <w:bookmarkEnd w:id="8"/>
           </w:p>
         </w:tc>
       </w:tr>
@@ -2395,7 +2462,24 @@
           <w:szCs w:val="22"/>
         </w:rPr>
         <w:t>Advisor: Kenneth Manly, Ph.D.</w:t>
-        <w:br/>
+      </w:r>
+    </w:p>
+    <w:p>
+      <w:pPr>
+        <w:pStyle w:val="Normal"/>
+        <w:spacing w:lineRule="auto" w:line="240" w:before="0" w:after="40"/>
+        <w:rPr>
+          <w:rFonts w:ascii="Arial" w:hAnsi="Arial" w:cs="Arial"/>
+          <w:sz w:val="8"/>
+          <w:szCs w:val="8"/>
+        </w:rPr>
+      </w:pPr>
+      <w:r>
+        <w:rPr>
+          <w:rFonts w:cs="Arial" w:ascii="Arial" w:hAnsi="Arial"/>
+          <w:sz w:val="8"/>
+          <w:szCs w:val="8"/>
+        </w:rPr>
       </w:r>
     </w:p>
     <w:p>
@@ -2595,15 +2679,15 @@
         <w:spacing w:lineRule="auto" w:line="240" w:before="0" w:after="80"/>
         <w:rPr>
           <w:rFonts w:ascii="Arial" w:hAnsi="Arial" w:cs="Arial"/>
-          <w:sz w:val="22"/>
-          <w:szCs w:val="22"/>
-        </w:rPr>
-      </w:pPr>
-      <w:r>
-        <w:rPr>
-          <w:rFonts w:cs="Arial" w:ascii="Arial" w:hAnsi="Arial"/>
-          <w:sz w:val="22"/>
-          <w:szCs w:val="22"/>
+          <w:sz w:val="8"/>
+          <w:szCs w:val="8"/>
+        </w:rPr>
+      </w:pPr>
+      <w:r>
+        <w:rPr>
+          <w:rFonts w:cs="Arial" w:ascii="Arial" w:hAnsi="Arial"/>
+          <w:sz w:val="8"/>
+          <w:szCs w:val="8"/>
         </w:rPr>
       </w:r>
     </w:p>
@@ -3050,15 +3134,15 @@
         <w:spacing w:lineRule="auto" w:line="240" w:before="0" w:after="80"/>
         <w:rPr>
           <w:rFonts w:ascii="Arial" w:hAnsi="Arial" w:cs="Arial"/>
-          <w:sz w:val="22"/>
-          <w:szCs w:val="22"/>
-        </w:rPr>
-      </w:pPr>
-      <w:r>
-        <w:rPr>
-          <w:rFonts w:cs="Arial" w:ascii="Arial" w:hAnsi="Arial"/>
-          <w:sz w:val="22"/>
-          <w:szCs w:val="22"/>
+          <w:sz w:val="8"/>
+          <w:szCs w:val="8"/>
+        </w:rPr>
+      </w:pPr>
+      <w:r>
+        <w:rPr>
+          <w:rFonts w:cs="Arial" w:ascii="Arial" w:hAnsi="Arial"/>
+          <w:sz w:val="8"/>
+          <w:szCs w:val="8"/>
         </w:rPr>
       </w:r>
     </w:p>
@@ -3247,18 +3331,15 @@
         <w:pStyle w:val="Normal"/>
         <w:spacing w:lineRule="auto" w:line="240" w:before="0" w:after="40"/>
         <w:rPr>
-          <w:rFonts w:ascii="Arial" w:hAnsi="Arial" w:cs="Arial"/>
-          <w:sz w:val="22"/>
-          <w:szCs w:val="22"/>
-        </w:rPr>
-      </w:pPr>
-      <w:r>
-        <w:rPr>
-          <w:rFonts w:cs="Arial" w:ascii="Arial" w:hAnsi="Arial"/>
-          <w:sz w:val="22"/>
-          <w:szCs w:val="22"/>
-        </w:rPr>
-        <w:t xml:space="preserve">    </w:t>
+          <w:sz w:val="8"/>
+          <w:szCs w:val="8"/>
+        </w:rPr>
+      </w:pPr>
+      <w:r>
+        <w:rPr>
+          <w:sz w:val="8"/>
+          <w:szCs w:val="8"/>
+        </w:rPr>
       </w:r>
     </w:p>
     <w:p>
@@ -3266,12 +3347,12 @@
         <w:pStyle w:val="cvheader1"/>
         <w:rPr/>
       </w:pPr>
-      <w:bookmarkStart w:id="8" w:name="X7596b6f8c511f4606f9618c22e9590597cd76ef"/>
+      <w:bookmarkStart w:id="9" w:name="X7596b6f8c511f4606f9618c22e9590597cd76ef"/>
       <w:r>
         <w:rPr/>
         <w:t xml:space="preserve">Selected Publications · </w:t>
       </w:r>
-      <w:hyperlink r:id="rId23">
+      <w:hyperlink r:id="rId27">
         <w:r>
           <w:rPr>
             <w:rStyle w:val="Hyperlink"/>
@@ -3300,7 +3381,7 @@
         <w:rPr/>
         <w:t xml:space="preserve">, Oden D, Spruell A, Linden DJ (2025) The Lateral Habenula Is Necessary for Maternal Behavior in the Naturally Parturient Primiparous Mouse Dam. eNeuro 13:12(1). </w:t>
       </w:r>
-      <w:hyperlink r:id="rId24">
+      <w:hyperlink r:id="rId28">
         <w:r>
           <w:rPr>
             <w:rStyle w:val="Hyperlink"/>
@@ -3333,7 +3414,7 @@
         <w:rPr/>
         <w:t xml:space="preserve"> (2024) SanPy: Software for the analysis and visualization of whole-cell current-clamp recordings. Biophys J 123:759–769. </w:t>
       </w:r>
-      <w:hyperlink r:id="rId25">
+      <w:hyperlink r:id="rId29">
         <w:r>
           <w:rPr>
             <w:rStyle w:val="Hyperlink"/>
@@ -3366,7 +3447,7 @@
         <w:rPr/>
         <w:t xml:space="preserve"> (2024) Brightest path tracing: A Python package to trace the brightest path in 2D and 3D images. bioRxiv:2023.07.16.549233. </w:t>
       </w:r>
-      <w:hyperlink r:id="rId26">
+      <w:hyperlink r:id="rId30">
         <w:r>
           <w:rPr>
             <w:rStyle w:val="Hyperlink"/>
@@ -3399,7 +3480,7 @@
         <w:rPr/>
         <w:t xml:space="preserve">, Huganir RL (2024) Stimulus-dependent synaptic plasticity underlies neuronal circuitry refinement in the mouse primary visual cortex. Cell Rep 43(4):113966. </w:t>
       </w:r>
-      <w:hyperlink r:id="rId27">
+      <w:hyperlink r:id="rId31">
         <w:r>
           <w:rPr>
             <w:rStyle w:val="Hyperlink"/>
@@ -3432,7 +3513,7 @@
         <w:rPr/>
         <w:t xml:space="preserve"> (2023) PiE: an open-source pipeline for home cage behavioral analysis. Front Neurosci 17:1222644. </w:t>
       </w:r>
-      <w:hyperlink r:id="rId28">
+      <w:hyperlink r:id="rId32">
         <w:r>
           <w:rPr>
             <w:rStyle w:val="Hyperlink"/>
@@ -3465,7 +3546,7 @@
         <w:rPr/>
         <w:t xml:space="preserve">*, Santana LF* (2021) The Organization of the Sinoatrial Node Microvasculature Varies Regionally to Match Local Myocyte Excitability. Function 2:zqab031. </w:t>
       </w:r>
-      <w:hyperlink r:id="rId29">
+      <w:hyperlink r:id="rId33">
         <w:r>
           <w:rPr>
             <w:rStyle w:val="Hyperlink"/>
@@ -3509,7 +3590,7 @@
         <w:rPr/>
         <w:t xml:space="preserve">, Wang X, Shen H (2020) Transient ischemia-reperfusion induces cortical hyperactivity and AMPAR trafficking in the somatosensory cortex. Aging 12:4299–4321. </w:t>
       </w:r>
-      <w:hyperlink r:id="rId30">
+      <w:hyperlink r:id="rId34">
         <w:r>
           <w:rPr>
             <w:rStyle w:val="Hyperlink"/>
@@ -3542,7 +3623,7 @@
         <w:rPr/>
         <w:t xml:space="preserve">, Tan HL, Hong I, Zhang Y, Huganir RL (2020) Cortical Synaptic AMPA Receptor Plasticity during Motor Learning. Neuron 105:895-908.e5. </w:t>
       </w:r>
-      <w:hyperlink r:id="rId31">
+      <w:hyperlink r:id="rId35">
         <w:r>
           <w:rPr>
             <w:rStyle w:val="Hyperlink"/>
@@ -3575,7 +3656,7 @@
         <w:rPr/>
         <w:t xml:space="preserve">, Huganir RL (2020) Lamina-specific AMPA receptor dynamics following visual deprivation in vivo. Elife 9:e52420. </w:t>
       </w:r>
-      <w:hyperlink r:id="rId32">
+      <w:hyperlink r:id="rId36">
         <w:r>
           <w:rPr>
             <w:rStyle w:val="Hyperlink"/>
@@ -3608,7 +3689,7 @@
         <w:rPr/>
         <w:t xml:space="preserve">, Linden DJ (2019) Estrogen-Dependent Functional Spine Dynamics in Neocortical Pyramidal Neurons of the Mouse. J Neurosci 39:4874–4888. </w:t>
       </w:r>
-      <w:hyperlink r:id="rId33">
+      <w:hyperlink r:id="rId37">
         <w:r>
           <w:rPr>
             <w:rStyle w:val="Hyperlink"/>
@@ -3637,7 +3718,7 @@
         <w:rPr/>
         <w:t xml:space="preserve">, Dougherty SE, Linden DJ (2017) Cerebral vascular structure in the motor cortex of adult mice is stable and is not altered by voluntary exercise. J Cereb Blood Flow Metab 37(12):3725-3743. </w:t>
       </w:r>
-      <w:hyperlink r:id="rId34">
+      <w:hyperlink r:id="rId38">
         <w:r>
           <w:rPr>
             <w:rStyle w:val="Hyperlink"/>
@@ -3670,7 +3751,7 @@
         <w:rPr/>
         <w:t xml:space="preserve">, Abdallah A, Pletnikov M, Hashemi P, Linden DJ (2016) Regrowth of Serotonin Axons in the Adult Mouse Brain Following Injury. Neuron 91(4):748-62. </w:t>
       </w:r>
-      <w:hyperlink r:id="rId35">
+      <w:hyperlink r:id="rId39">
         <w:r>
           <w:rPr>
             <w:rStyle w:val="Hyperlink"/>
@@ -3703,7 +3784,7 @@
         <w:rPr/>
         <w:t xml:space="preserve">*, Lin D, Linden DJ, Huganir RL (2015) Visualization of NMDA receptor– dependent AMPA receptor synaptic plasticity in vivo. Nature Neuroscience 18(3):402-7. </w:t>
       </w:r>
-      <w:hyperlink r:id="rId36">
+      <w:hyperlink r:id="rId40">
         <w:r>
           <w:rPr>
             <w:rStyle w:val="Hyperlink"/>
@@ -3726,14 +3807,29 @@
         <w:tab/>
         <w:t>* Equal contribution</w:t>
       </w:r>
-      <w:bookmarkEnd w:id="8"/>
+      <w:bookmarkEnd w:id="9"/>
+    </w:p>
+    <w:p>
+      <w:pPr>
+        <w:pStyle w:val="cvreference"/>
+        <w:rPr>
+          <w:sz w:val="8"/>
+          <w:szCs w:val="8"/>
+        </w:rPr>
+      </w:pPr>
+      <w:r>
+        <w:rPr>
+          <w:sz w:val="8"/>
+          <w:szCs w:val="8"/>
+        </w:rPr>
+      </w:r>
     </w:p>
     <w:p>
       <w:pPr>
         <w:pStyle w:val="cvheader1"/>
         <w:rPr/>
       </w:pPr>
-      <w:bookmarkStart w:id="9" w:name="selected-conference-abstracts"/>
+      <w:bookmarkStart w:id="10" w:name="selected-conference-abstracts"/>
       <w:r>
         <w:rPr/>
         <w:t>Selected Conference Abstracts</w:t>
@@ -3891,7 +3987,7 @@
         <w:rPr/>
         <w:t>, Huganir RL (2018) Distance-dependent AMPA receptor dynamics following visual deprivation in vivo. Society For Neuroscience Abstract. 288.06</w:t>
       </w:r>
-      <w:bookmarkEnd w:id="9"/>
+      <w:bookmarkEnd w:id="10"/>
     </w:p>
     <w:sectPr>
       <w:type w:val="nextPage"/>
@@ -4366,7 +4462,7 @@
   </w:style>
   <w:style w:type="paragraph" w:styleId="Heading3">
     <w:name w:val="heading 3"/>
-    <w:basedOn w:val="Normal"/>
+    <w:basedOn w:val="Heading2"/>
     <w:next w:val="Normal"/>
     <w:link w:val="Heading3Char"/>
     <w:uiPriority w:val="9"/>
@@ -4382,9 +4478,7 @@
     </w:pPr>
     <w:rPr>
       <w:rFonts w:eastAsia="" w:cs="" w:cstheme="majorBidi" w:eastAsiaTheme="majorEastAsia"/>
-      <w:color w:themeColor="accent1" w:themeShade="bf" w:val="0F4761"/>
-      <w:sz w:val="28"/>
-      <w:szCs w:val="28"/>
+      <w:u w:val="none"/>
     </w:rPr>
   </w:style>
   <w:style w:type="paragraph" w:styleId="Heading4">

</xml_diff>